<commit_message>
complete advanced rag extensions and polish deliverables
</commit_message>
<xml_diff>
--- a/report/redis_rag_report.docx
+++ b/report/redis_rag_report.docx
@@ -58,7 +58,7 @@
           <w:color w:val="17212B"/>
           <w:sz w:val="21"/>
         </w:rPr>
-        <w:t>本文围绕 Redis 技术文档构建了一个垂直领域深度问答系统。系统以 Redis 官方文档和清洗后的课程语料为私有知识库，完成了文档采集、文本清洗、Chunking、Embedding、向量数据库构建、混合检索、轻量重排序、上下文增强生成和三维量化评估。针对 Redis 问答中命令名、缩写和概念术语密集的特点，系统采用 Query Rewriting、BM25/Vector Hybrid Retrieval 与 Lightweight Reranking 作为高级 RAG 优化策略。生成模块支持 DeepSeek/OpenAI-compatible API，同时保留抽取式生成回退，保证无 API key 环境下也能复现。实验在 10 条 Redis 技术问题上评估 Context Relevance、Faithfulness 和 Answer Relevance，结果分别为 1.0000、0.8159 和 0.8750。结果表明，混合检索和二阶段重排序能稳定召回相关文档并改善上下文质量，基于上下文的生成方式能降低幻觉风险，但系统仍受默认 embedding 表达能力和评估集规模限制。</w:t>
+        <w:t>本文围绕 Redis 技术文档构建了一个垂直领域深度问答系统。系统以 Redis 官方文档主题和清洗后的课程语料为私有知识库，完成了文档采集、文本清洗、Chunking、Embedding、向量数据库构建、Query Rewriting、混合检索、二阶段重排序、基于上下文的答案生成、自动 citation checking 和三维量化评估。针对 Redis 问答中命令名、缩写和概念术语密集的特点，系统默认采用可复现的 hashing embedding 与 BM25/Vector Hybrid Retrieval，同时提供 BGE embedding、FAISS/Chroma 向量库、BGE reranker/CrossEncoder reranker 等增强入口。实验在 20 条 Redis 技术问题上评估 Context Relevance、Faithfulness 和 Answer Relevance，结果分别为 0.9750、0.8319 和 0.9375；检索消融实验显示，pure vector、BM25、hybrid、hybrid+rerank 的 Context Relevance 分别为 0.8750、1.0000、0.9750 和 0.9750。结果表明，Redis 这类命令密集型技术问答非常依赖精确术语匹配，混合检索与重排序能提高可解释性并减少弱相关上下文污染，citation checking 则为生成答案提供了额外的幻觉防护。</w:t>
       </w:r>
     </w:p>
     <w:p>
@@ -68,7 +68,7 @@
           <w:color w:val="17212B"/>
           <w:sz w:val="21"/>
         </w:rPr>
-        <w:t>关键词： RAG；Redis；垂直领域问答；混合检索；Query Rewriting；Reranking；Faithfulness</w:t>
+        <w:t>关键词： RAG；Redis；垂直领域问答；混合检索；Query Rewriting；Reranking；Citation Checking；Faithfulness</w:t>
       </w:r>
     </w:p>
     <w:p>
@@ -86,7 +86,7 @@
           <w:color w:val="17212B"/>
           <w:sz w:val="21"/>
         </w:rPr>
-        <w:t>大语言模型具备较强的通用问答能力，但在垂直领域问答中仍存在明显局限。对于 Redis 这类技术文档任务，用户问题往往涉及精确命令、参数语义、系统架构和工程实践。例如，用户可能询问 “AOF 和 RDB 的区别”“WATCH 在事务中的作用”“Stream 和 Pub/Sub 的可靠性差异”。这些问题要求答案不仅语言通顺，还必须与官方文档一致。</w:t>
+        <w:t>大语言模型具备较强的通用问答能力，但在垂直领域任务中仍存在明显局限。对于 Redis 这类技术文档问答，用户问题往往涉及精确命令、参数语义、系统架构和工程实践，例如 “AOF 和 RDB 的区别”“WATCH 在事务中的作用”“Stream 和 Pub/Sub 的可靠性差异”“Redis Cluster 为什么跨 slot 多 key 命令受限制”。这些问题不仅要求回答语言通顺，还要求答案与官方文档一致，并能给出可追溯来源。</w:t>
       </w:r>
     </w:p>
     <w:p>
@@ -96,7 +96,7 @@
           <w:color w:val="17212B"/>
           <w:sz w:val="21"/>
         </w:rPr>
-        <w:t>如果直接让大模型凭参数记忆回答，容易出现三类问题。第一，模型可能混淆不同版本或不同系统的机制。第二，模型可能编造不存在的命令参数或错误使用场景。第三，模型难以给出可追溯来源，用户无法判断答案是否可靠。RAG 技术通过“先检索，再生成”的方式，把大模型回答约束在知识库上下文中，是降低幻觉、提升可解释性的主流方案。</w:t>
+        <w:t>如果直接让大模型凭参数记忆回答，容易出现三类问题。第一，模型可能混淆不同 Redis 版本或不同系统的机制。第二，模型可能编造不存在的命令参数或错误使用场景。第三，模型难以给出可追溯来源，用户无法判断答案是否可靠。RAG 技术通过“先检索，再生成”的方式，把大模型回答约束在知识库上下文中，是降低幻觉、提升可解释性的主流方案。</w:t>
       </w:r>
     </w:p>
     <w:p>
@@ -106,7 +106,7 @@
           <w:color w:val="17212B"/>
           <w:sz w:val="21"/>
         </w:rPr>
-        <w:t>本文选择 Redis 作为垂直领域，是因为 Redis 文档知识边界清晰，同时又包含大量命令名和缩写。这个特点使得 Redis 问答很适合展示 RAG 系统中检索策略的重要性：纯语义相似度可能忽略精确术语，而纯关键词检索又可能无法处理中文提问和英文文档之间的表达差异。因此，本文重点实现并分析 Query Rewriting 与混合检索策略。</w:t>
+        <w:t>本文选择 Redis 作为垂直领域，是因为 Redis 文档知识边界清晰，同时包含大量命令名和缩写。这个特点使 Redis 问答很适合展示 RAG 系统中检索策略的重要性：纯语义相似度可能忽略精确术语，而纯关键词检索又可能无法处理中文提问和英文文档之间的表达差异。因此，本文重点实现并分析 Query Rewriting、混合检索、二阶段重排序和 citation checking。</w:t>
       </w:r>
     </w:p>
     <w:p>
@@ -163,7 +163,7 @@
           <w:color w:val="17212B"/>
           <w:sz w:val="20"/>
         </w:rPr>
-        <w:t>选择并实现 Embedding 模型，将 chunk 存入本地向量数据库。</w:t>
+        <w:t>选择并实现 Embedding 模型，将 chunk 存入向量数据库。</w:t>
       </w:r>
     </w:p>
     <w:p>
@@ -176,7 +176,7 @@
           <w:color w:val="17212B"/>
           <w:sz w:val="20"/>
         </w:rPr>
-        <w:t>实现基于检索上下文的答案生成，支持 DeepSeek API 和本地回退。</w:t>
+        <w:t>实现基于检索上下文的答案生成，支持 DeepSeek API 和本地抽取式回退。</w:t>
       </w:r>
     </w:p>
     <w:p>
@@ -189,7 +189,7 @@
           <w:color w:val="17212B"/>
           <w:sz w:val="20"/>
         </w:rPr>
-        <w:t>至少实现一种高级 RAG 优化策略，本项目实现 Query Rewriting、Hybrid Retrieval 与 Lightweight Reranking。</w:t>
+        <w:t>至少实现一种高级 RAG 优化策略；本项目实现 Query Rewriting、Hybrid Retrieval、Reranking 和 citation checking。</w:t>
       </w:r>
     </w:p>
     <w:p>
@@ -215,7 +215,20 @@
           <w:color w:val="17212B"/>
           <w:sz w:val="20"/>
         </w:rPr>
-        <w:t>提供完整代码仓库、README、依赖文件和一键推理脚本。</w:t>
+        <w:t>增加检索策略消融实验，对比 pure vector、BM25、hybrid 和 hybrid+rerank。</w:t>
+      </w:r>
+    </w:p>
+    <w:p>
+      <w:pPr>
+        <w:pStyle w:val="ListNumber"/>
+      </w:pPr>
+      <w:r>
+        <w:rPr>
+          <w:rFonts w:ascii="Calibri" w:hAnsi="Calibri" w:eastAsia="Microsoft YaHei"/>
+          <w:color w:val="17212B"/>
+          <w:sz w:val="20"/>
+        </w:rPr>
+        <w:t>提供完整代码仓库、README、依赖文件、一键推理脚本、可编辑 Word 报告和汇报 PPT。</w:t>
       </w:r>
     </w:p>
     <w:p>
@@ -822,7 +835,7 @@
           <w:color w:val="17212B"/>
           <w:sz w:val="21"/>
         </w:rPr>
-        <w:t>系统由七个模块组成：文档处理、Chunking、Embedding、向量库、检索、生成和评估。</w:t>
+        <w:t>系统由八个模块组成：文档处理、Chunking、Embedding、向量库、检索、重排序、生成和评估。</w:t>
       </w:r>
     </w:p>
     <w:p>
@@ -874,7 +887,7 @@
           <w:color w:val="17212B"/>
           <w:sz w:val="20"/>
         </w:rPr>
-        <w:t>本地向量库将 chunk、向量和元数据持久化到 JSONL 文件。</w:t>
+        <w:t>向量库将 chunk、向量和元数据持久化。</w:t>
       </w:r>
     </w:p>
     <w:p>
@@ -900,7 +913,7 @@
           <w:color w:val="17212B"/>
           <w:sz w:val="20"/>
         </w:rPr>
-        <w:t>轻量重排序模块根据术语覆盖率和标题覆盖率对候选片段二次排序。</w:t>
+        <w:t>重排序模块根据术语覆盖率、标题覆盖率或 CrossEncoder 分数二次排序。</w:t>
       </w:r>
     </w:p>
     <w:p>
@@ -926,7 +939,7 @@
           <w:color w:val="17212B"/>
           <w:sz w:val="20"/>
         </w:rPr>
-        <w:t>评估模块输出三维量化指标和逐样本明细。</w:t>
+        <w:t>评估模块输出三维量化指标、citation checking 和检索消融结果。</w:t>
       </w:r>
     </w:p>
     <w:p>
@@ -950,9 +963,11 @@
         </w:rPr>
         <w:t>Redis 文档 -&gt; 清洗 JSONL -&gt; Chunking -&gt; Embedding + BM25</w:t>
         <w:br/>
-        <w:t>用户问题 -&gt; Query Rewriting -&gt; Hybrid Retrieval -&gt; Lightweight Reranking</w:t>
+        <w:t>用户问题 -&gt; Query Rewriting -&gt; Hybrid Retrieval -&gt; Reranking</w:t>
         <w:br/>
-        <w:t>Reranked Contexts -&gt; Context Filtering -&gt; DeepSeek/抽取式生成器 -&gt; 带引用答案</w:t>
+        <w:t>Reranked Contexts -&gt; Context Filtering -&gt; DeepSeek/抽取式生成器</w:t>
+        <w:br/>
+        <w:t>生成答案 -&gt; Citation Checking -&gt; 三维评估与结果导出</w:t>
       </w:r>
     </w:p>
     <w:p>
@@ -1043,7 +1058,7 @@
           <w:color w:val="17212B"/>
           <w:sz w:val="21"/>
         </w:rPr>
-        <w:t>在内置语料中，大多数主题文档长度适中，默认参数可以保留自然段落，避免把答案切成不可读的 token 串。当换成更长的官方文档时，仍可以通过命令行参数调小 chunk size。</w:t>
+        <w:t>该参数让每个 chunk 既保留足够上下文，又不会把过多弱相关内容传给生成器。当换成更长的官方文档时，可以通过命令行参数调整 chunk size 和 overlap。</w:t>
       </w:r>
     </w:p>
     <w:p>
@@ -1052,6 +1067,14 @@
       </w:pPr>
       <w:r>
         <w:t>6. Embedding 与向量数据库</w:t>
+      </w:r>
+    </w:p>
+    <w:p>
+      <w:pPr>
+        <w:pStyle w:val="Heading2"/>
+      </w:pPr>
+      <w:r>
+        <w:t>6.1 默认可复现 embedding</w:t>
       </w:r>
     </w:p>
     <w:p>
@@ -1123,7 +1146,15 @@
           <w:color w:val="17212B"/>
           <w:sz w:val="21"/>
         </w:rPr>
-        <w:t>其局限也很明确：hashing embedding 缺少深层语义表达能力，不如 BGE、E5 或 SentenceTransformer。真实部署时，可以将 HashingEmbeddingModel 替换为 BAAI/bge-small-zh-v1.5、BAAI/bge-base-zh-v1.5 或其他多语言 embedding 模型。</w:t>
+        <w:t>其局限也很明确：hashing embedding 缺少深层语义表达能力，不如 BGE、E5 或 SentenceTransformer。对于“热点缓存失效导致数据库压力突增”这类复杂同义表达，默认 embedding 需要依赖 Query Rewriting 和 BM25 才能稳定召回。</w:t>
+      </w:r>
+    </w:p>
+    <w:p>
+      <w:pPr>
+        <w:pStyle w:val="Heading2"/>
+      </w:pPr>
+      <w:r>
+        <w:t>6.2 BGE/SentenceTransformer 增强</w:t>
       </w:r>
     </w:p>
     <w:p>
@@ -1133,7 +1164,49 @@
           <w:color w:val="17212B"/>
           <w:sz w:val="21"/>
         </w:rPr>
-        <w:t>向量库使用本地 JSONL 文件实现：</w:t>
+        <w:t>为了提高作业难度和工程完整度，项目已经提供 SentenceTransformerEmbeddingModel。安装 sentence-transformers 后，可以通过命令行切换到 BGE：</w:t>
+      </w:r>
+    </w:p>
+    <w:p>
+      <w:pPr>
+        <w:pStyle w:val="CodeBlock"/>
+      </w:pPr>
+      <w:r>
+        <w:rPr>
+          <w:rFonts w:ascii="Calibri" w:hAnsi="Calibri" w:eastAsia="Courier New"/>
+          <w:sz w:val="17"/>
+        </w:rPr>
+        <w:t>python3 build_index.py --embedding-model bge --vector-store faiss</w:t>
+        <w:br/>
+        <w:t>python3 infer.py --question "Redis 如何设置互斥锁？" --embedding-model bge --vector-store faiss --rebuild</w:t>
+      </w:r>
+    </w:p>
+    <w:p>
+      <w:r>
+        <w:rPr>
+          <w:rFonts w:ascii="Calibri" w:hAnsi="Calibri" w:eastAsia="Microsoft YaHei"/>
+          <w:color w:val="17212B"/>
+          <w:sz w:val="21"/>
+        </w:rPr>
+        <w:t>支持的简写包括 bge、bge-small-zh、bge-base-zh，也可以直接传入任意 SentenceTransformer 模型名。由于 embedding 维度会变化，更换 embedding 后需要重新构建索引。</w:t>
+      </w:r>
+    </w:p>
+    <w:p>
+      <w:pPr>
+        <w:pStyle w:val="Heading2"/>
+      </w:pPr>
+      <w:r>
+        <w:t>6.3 Local、FAISS 与 Chroma 向量库</w:t>
+      </w:r>
+    </w:p>
+    <w:p>
+      <w:r>
+        <w:rPr>
+          <w:rFonts w:ascii="Calibri" w:hAnsi="Calibri" w:eastAsia="Microsoft YaHei"/>
+          <w:color w:val="17212B"/>
+          <w:sz w:val="21"/>
+        </w:rPr>
+        <w:t>默认向量库是 JSONL 本地向量库：</w:t>
       </w:r>
     </w:p>
     <w:p>
@@ -1155,7 +1228,7 @@
           <w:color w:val="17212B"/>
           <w:sz w:val="21"/>
         </w:rPr>
-        <w:t>每条记录保存 chunk 元数据和向量。这样虽然不如 FAISS 或 Chroma 高性能，但结构透明，便于课程作业解释“向量数据库中到底存了什么”。</w:t>
+        <w:t>该方式透明、易检查，适合课程讲解“向量数据库中到底保存了什么”。同时，项目已经提供 FAISS 和 Chroma 入口：FAISS 使用 IndexFlatIP 做内积检索，Chroma 使用 in-memory collection 做本地实验。普通验收时使用 local 后端即可；如果老师希望看到更接近生产系统的实现，可以安装可选依赖后切换后端。</w:t>
       </w:r>
     </w:p>
     <w:p>
@@ -1446,7 +1519,7 @@
                 <w:color w:val="17212B"/>
                 <w:sz w:val="19"/>
               </w:rPr>
-              <w:t>Lua</w:t>
+              <w:t>互斥锁</w:t>
             </w:r>
           </w:p>
         </w:tc>
@@ -1468,7 +1541,53 @@
                 <w:color w:val="17212B"/>
                 <w:sz w:val="19"/>
               </w:rPr>
-              <w:t>eval, script, scripting, atomic</w:t>
+              <w:t>mutex, lock, SET, NX, EX, PX</w:t>
+            </w:r>
+          </w:p>
+        </w:tc>
+      </w:tr>
+      <w:tr>
+        <w:tc>
+          <w:tcPr>
+            <w:tcW w:type="dxa" w:w="4824"/>
+            <w:vAlign w:val="center"/>
+          </w:tcPr>
+          <w:p>
+            <w:pPr>
+              <w:spacing w:after="40"/>
+              <w:jc w:val="left"/>
+            </w:pPr>
+            <w:r/>
+            <w:r>
+              <w:rPr>
+                <w:rFonts w:ascii="Calibri" w:hAnsi="Calibri" w:eastAsia="Microsoft YaHei"/>
+                <w:b w:val="0"/>
+                <w:color w:val="17212B"/>
+                <w:sz w:val="19"/>
+              </w:rPr>
+              <w:t>字段过期</w:t>
+            </w:r>
+          </w:p>
+        </w:tc>
+        <w:tc>
+          <w:tcPr>
+            <w:tcW w:type="dxa" w:w="4824"/>
+            <w:vAlign w:val="center"/>
+          </w:tcPr>
+          <w:p>
+            <w:pPr>
+              <w:spacing w:after="40"/>
+              <w:jc w:val="left"/>
+            </w:pPr>
+            <w:r/>
+            <w:r>
+              <w:rPr>
+                <w:rFonts w:ascii="Calibri" w:hAnsi="Calibri" w:eastAsia="Microsoft YaHei"/>
+                <w:b w:val="0"/>
+                <w:color w:val="17212B"/>
+                <w:sz w:val="19"/>
+              </w:rPr>
+              <w:t>hash field expiration, TTL</w:t>
             </w:r>
           </w:p>
         </w:tc>
@@ -1540,7 +1659,7 @@
           <w:color w:val="17212B"/>
           <w:sz w:val="21"/>
         </w:rPr>
-        <w:t>混合检索解决了“召回”问题，但 Top-k 候选中仍可能混入弱相关片段。例如 AOF/RDB 问题中，Pub/Sub 文档包含“消息不会持久化”，因此也可能被召回。为了进一步提高进入生成器的上下文质量，系统实现了一个轻量二阶段重排序器。</w:t>
+        <w:t>混合检索解决了召回问题，但 Top-k 候选中仍可能混入弱相关片段。例如 AOF/RDB 问题中，Pub/Sub 文档包含“消息不会持久化”，因此也可能被召回。为了进一步提高进入生成器的上下文质量，系统实现了一个轻量二阶段重排序器。</w:t>
       </w:r>
     </w:p>
     <w:p>
@@ -1608,7 +1727,7 @@
           <w:color w:val="17212B"/>
           <w:sz w:val="21"/>
         </w:rPr>
-        <w:t>这个公式的设计意图是保留 hybrid score 的主体地位，同时对术语覆盖更完整、标题更相关的候选片段给予奖励。它不是深度 cross-encoder reranker，但具有三个优点：无需额外模型、可解释、可离线复现。对于课程作业而言，这比只做单层检索更能体现 RAG 系统的优化深度。</w:t>
+        <w:t>这个公式的设计意图是保留 hybrid score 的主体地位，同时对术语覆盖更完整、标题更相关的候选片段给予奖励。它不是深度 cross-encoder reranker，但具有三个优点：无需额外模型、可解释、可离线复现。</w:t>
       </w:r>
     </w:p>
     <w:p>
@@ -1616,7 +1735,51 @@
         <w:pStyle w:val="Heading2"/>
       </w:pPr>
       <w:r>
-        <w:t>7.4 生成阶段上下文过滤</w:t>
+        <w:t>7.4 BGE Reranker / CrossEncoder 增强</w:t>
+      </w:r>
+    </w:p>
+    <w:p>
+      <w:r>
+        <w:rPr>
+          <w:rFonts w:ascii="Calibri" w:hAnsi="Calibri" w:eastAsia="Microsoft YaHei"/>
+          <w:color w:val="17212B"/>
+          <w:sz w:val="21"/>
+        </w:rPr>
+        <w:t>为了满足更前沿的 RAG 实践，项目还提供 BGE reranker / CrossEncoder reranker 入口。安装 sentence-transformers 后，可以运行：</w:t>
+      </w:r>
+    </w:p>
+    <w:p>
+      <w:pPr>
+        <w:pStyle w:val="CodeBlock"/>
+      </w:pPr>
+      <w:r>
+        <w:rPr>
+          <w:rFonts w:ascii="Calibri" w:hAnsi="Calibri" w:eastAsia="Courier New"/>
+          <w:sz w:val="17"/>
+        </w:rPr>
+        <w:t>python3 infer.py \</w:t>
+        <w:br/>
+        <w:t xml:space="preserve">  --question "Redis Stream 的消费者组有什么作用？" \</w:t>
+        <w:br/>
+        <w:t xml:space="preserve">  --reranker bge-reranker</w:t>
+      </w:r>
+    </w:p>
+    <w:p>
+      <w:r>
+        <w:rPr>
+          <w:rFonts w:ascii="Calibri" w:hAnsi="Calibri" w:eastAsia="Microsoft YaHei"/>
+          <w:color w:val="17212B"/>
+          <w:sz w:val="21"/>
+        </w:rPr>
+        <w:t>CrossEncoder reranker 会把“问题 + 候选片段”作为成对输入重新打分，相比只看 term coverage 的轻量方法，能更好处理同义表达和长距离语义关系。考虑到课程复现环境不一定有模型缓存或 GPU，默认仍保留轻量 reranker。</w:t>
+      </w:r>
+    </w:p>
+    <w:p>
+      <w:pPr>
+        <w:pStyle w:val="Heading2"/>
+      </w:pPr>
+      <w:r>
+        <w:t>7.5 生成阶段上下文过滤</w:t>
       </w:r>
     </w:p>
     <w:p>
@@ -1637,6 +1800,73 @@
           <w:sz w:val="21"/>
         </w:rPr>
         <w:t>这个步骤说明：RAG 系统不仅要考虑召回率，还要控制传入 LLM 的上下文质量。</w:t>
+      </w:r>
+    </w:p>
+    <w:p>
+      <w:pPr>
+        <w:pStyle w:val="Heading2"/>
+      </w:pPr>
+      <w:r>
+        <w:t>7.6 Citation Checking</w:t>
+      </w:r>
+    </w:p>
+    <w:p>
+      <w:r>
+        <w:rPr>
+          <w:rFonts w:ascii="Calibri" w:hAnsi="Calibri" w:eastAsia="Microsoft YaHei"/>
+          <w:color w:val="17212B"/>
+          <w:sz w:val="21"/>
+        </w:rPr>
+        <w:t>RAG 答案有引用并不代表一定可靠，因为模型可能输出不存在的 [9]，也可能把答案内容写得和被引用上下文没有关系。为此，项目在生成后加入自动 citation checking，检查三件事：</w:t>
+      </w:r>
+    </w:p>
+    <w:p>
+      <w:pPr>
+        <w:pStyle w:val="ListNumber"/>
+      </w:pPr>
+      <w:r>
+        <w:rPr>
+          <w:rFonts w:ascii="Calibri" w:hAnsi="Calibri" w:eastAsia="Microsoft YaHei"/>
+          <w:color w:val="17212B"/>
+          <w:sz w:val="20"/>
+        </w:rPr>
+        <w:t>答案是否包含 [1]、[2] 形式引用。</w:t>
+      </w:r>
+    </w:p>
+    <w:p>
+      <w:pPr>
+        <w:pStyle w:val="ListNumber"/>
+      </w:pPr>
+      <w:r>
+        <w:rPr>
+          <w:rFonts w:ascii="Calibri" w:hAnsi="Calibri" w:eastAsia="Microsoft YaHei"/>
+          <w:color w:val="17212B"/>
+          <w:sz w:val="20"/>
+        </w:rPr>
+        <w:t>引用编号是否在当前检索上下文范围内。</w:t>
+      </w:r>
+    </w:p>
+    <w:p>
+      <w:pPr>
+        <w:pStyle w:val="ListNumber"/>
+      </w:pPr>
+      <w:r>
+        <w:rPr>
+          <w:rFonts w:ascii="Calibri" w:hAnsi="Calibri" w:eastAsia="Microsoft YaHei"/>
+          <w:color w:val="17212B"/>
+          <w:sz w:val="20"/>
+        </w:rPr>
+        <w:t>答案 token 与被引用上下文 token 是否存在支持关系。</w:t>
+      </w:r>
+    </w:p>
+    <w:p>
+      <w:r>
+        <w:rPr>
+          <w:rFonts w:ascii="Calibri" w:hAnsi="Calibri" w:eastAsia="Microsoft YaHei"/>
+          <w:color w:val="17212B"/>
+          <w:sz w:val="21"/>
+        </w:rPr>
+        <w:t>infer.py --json 会输出 citation_check，evaluate.py 会在逐样本结果中保存 citation_passed。这不是完美事实核查，但能发现一批低级引用错误，并让 RAG 系统更可审计。</w:t>
       </w:r>
     </w:p>
     <w:p>
@@ -1684,7 +1914,7 @@
           <w:color w:val="17212B"/>
           <w:sz w:val="21"/>
         </w:rPr>
-        <w:t>这种双模式设计兼顾了前沿实践和可复现性。</w:t>
+        <w:t>这种双模式设计兼顾了前沿实践和可复现性。答辩演示时，即使没有网络和 API key，也能稳定展示系统从检索到生成再到评估的完整流程。</w:t>
       </w:r>
     </w:p>
     <w:p>
@@ -1702,7 +1932,7 @@
           <w:color w:val="17212B"/>
           <w:sz w:val="21"/>
         </w:rPr>
-        <w:t>评估集位于 data/eval/eval_questions.jsonl，包含 10 条 Redis 技术问题。每条样本包含 question、gold_doc_ids 和 expected_keywords。</w:t>
+        <w:t>评估集位于 data/eval/eval_questions.jsonl，包含 20 条 Redis 技术问题。每条样本包含 question、gold_doc_ids 和 expected_keywords。问题覆盖持久化、数据结构、过期机制、内存淘汰、复制、集群、事务、Lua、Stream、互斥锁、缓存风险等主题。</w:t>
       </w:r>
     </w:p>
     <w:p>
@@ -1782,7 +2012,7 @@
           <w:color w:val="17212B"/>
           <w:sz w:val="21"/>
         </w:rPr>
-        <w:t>它主要评价生成模块是否发生幻觉。</w:t>
+        <w:t>它主要评价生成模块是否发生幻觉。当前实现是轻量自动指标，适合作业展示；更严格版本可以使用 NLI 模型、LLM-as-a-judge 或人工标注。</w:t>
       </w:r>
     </w:p>
     <w:p>
@@ -1965,7 +2195,7 @@
                 <w:color w:val="17212B"/>
                 <w:sz w:val="19"/>
               </w:rPr>
-              <w:t>1.0000</w:t>
+              <w:t>0.9750</w:t>
             </w:r>
           </w:p>
         </w:tc>
@@ -2011,7 +2241,7 @@
                 <w:color w:val="17212B"/>
                 <w:sz w:val="19"/>
               </w:rPr>
-              <w:t>0.8159</w:t>
+              <w:t>0.8319</w:t>
             </w:r>
           </w:p>
         </w:tc>
@@ -2057,7 +2287,7 @@
                 <w:color w:val="17212B"/>
                 <w:sz w:val="19"/>
               </w:rPr>
-              <w:t>0.8750</w:t>
+              <w:t>0.9375</w:t>
             </w:r>
           </w:p>
         </w:tc>
@@ -2071,7 +2301,7 @@
           <w:color w:val="17212B"/>
           <w:sz w:val="21"/>
         </w:rPr>
-        <w:t>Context Relevance 达到 1.0000，说明当前知识库规模下，混合检索与重排序能够覆盖标注相关文档。Faithfulness 为 0.8159，说明答案多数 token 能从检索上下文中得到支持。Answer Relevance 为 0.8750，说明答案覆盖了大部分期望关键词，但仍有少数问题因为抽取式表达与预期关键词不完全一致而失分。</w:t>
+        <w:t>Context Relevance 为 0.9750，说明当前知识库规模下，混合检索与重排序基本能够覆盖标注相关文档。Faithfulness 为 0.8319，说明答案多数 token 能从检索上下文中得到支持。Answer Relevance 为 0.9375，说明答案覆盖了大部分期望关键词。</w:t>
       </w:r>
     </w:p>
     <w:p>
@@ -2081,7 +2311,15 @@
           <w:color w:val="17212B"/>
           <w:sz w:val="21"/>
         </w:rPr>
-        <w:t>逐样本观察显示，持久化、过期、Stream/PubSub、Sentinel、事务和 Lua 问题表现较好；Sorted Set 和内存淘汰问题的 Answer Relevance 相对较低，主要因为抽取句未完整覆盖所有期望关键词。</w:t>
+        <w:t>逐样本观察显示，持久化、过期、Stream/Pub/Sub、Sentinel、事务、Lua、互斥锁等问题表现较好；个别问题的 Context Relevance 未达到 1.0000，主要是因为一个问题的 gold doc 涉及多个主题，而 Top-k 中只召回了其中一部分。这个现象也说明，真实 RAG 评估不能只看平均分，还需要做 bad case 分析。</w:t>
+      </w:r>
+    </w:p>
+    <w:p>
+      <w:pPr>
+        <w:pStyle w:val="Heading1"/>
+      </w:pPr>
+      <w:r>
+        <w:t>11. 检索策略消融实验</w:t>
       </w:r>
     </w:p>
     <w:p>
@@ -2091,7 +2329,518 @@
           <w:color w:val="17212B"/>
           <w:sz w:val="21"/>
         </w:rPr>
-        <w:t>此外，本项目保留真实运行日志用于展示材料生成。例如 AOF/RDB 问题的一键推理输出中，redis:persistence 的 combined_score 为 1.0000，经过轻量重排序后的 score 为 1.0819，term_coverage 为 0.3333。这个结果说明系统不仅能召回正确文档，还能通过术语覆盖率进一步解释为什么该文档应排在第一位。</w:t>
+        <w:t>为了说明高级检索策略的作用，项目提供 compare_retrieval.py，对比 pure vector、BM25、hybrid、hybrid+rerank 四种策略。</w:t>
+      </w:r>
+    </w:p>
+    <w:p>
+      <w:r>
+        <w:rPr>
+          <w:rFonts w:ascii="Calibri" w:hAnsi="Calibri" w:eastAsia="Microsoft YaHei"/>
+          <w:color w:val="17212B"/>
+          <w:sz w:val="21"/>
+        </w:rPr>
+        <w:t>运行命令：</w:t>
+      </w:r>
+    </w:p>
+    <w:p>
+      <w:pPr>
+        <w:pStyle w:val="CodeBlock"/>
+      </w:pPr>
+      <w:r>
+        <w:rPr>
+          <w:rFonts w:ascii="Calibri" w:hAnsi="Calibri" w:eastAsia="Courier New"/>
+          <w:sz w:val="17"/>
+        </w:rPr>
+        <w:t>python3 compare_retrieval.py --rebuild</w:t>
+      </w:r>
+    </w:p>
+    <w:p>
+      <w:r>
+        <w:rPr>
+          <w:rFonts w:ascii="Calibri" w:hAnsi="Calibri" w:eastAsia="Microsoft YaHei"/>
+          <w:color w:val="17212B"/>
+          <w:sz w:val="21"/>
+        </w:rPr>
+        <w:t>结果如下：</w:t>
+      </w:r>
+    </w:p>
+    <w:tbl>
+      <w:tblPr>
+        <w:tblStyle w:val="TableGrid"/>
+        <w:tblW w:type="auto" w:w="0"/>
+        <w:jc w:val="center"/>
+        <w:tblLook w:firstColumn="1" w:firstRow="1" w:lastColumn="0" w:lastRow="0" w:noHBand="0" w:noVBand="1" w:val="04A0"/>
+      </w:tblPr>
+      <w:tblGrid>
+        <w:gridCol w:w="2412"/>
+        <w:gridCol w:w="2412"/>
+        <w:gridCol w:w="2412"/>
+        <w:gridCol w:w="2412"/>
+      </w:tblGrid>
+      <w:tr>
+        <w:tc>
+          <w:tcPr>
+            <w:tcW w:type="dxa" w:w="2412"/>
+            <w:shd w:fill="FDE8E5"/>
+            <w:vAlign w:val="center"/>
+          </w:tcPr>
+          <w:p>
+            <w:pPr>
+              <w:spacing w:after="40"/>
+              <w:jc w:val="left"/>
+            </w:pPr>
+            <w:r/>
+            <w:r>
+              <w:rPr>
+                <w:rFonts w:ascii="Calibri" w:hAnsi="Calibri" w:eastAsia="Microsoft YaHei"/>
+                <w:b/>
+                <w:color w:val="17212B"/>
+                <w:sz w:val="19"/>
+              </w:rPr>
+              <w:t>策略</w:t>
+            </w:r>
+          </w:p>
+        </w:tc>
+        <w:tc>
+          <w:tcPr>
+            <w:tcW w:type="dxa" w:w="2412"/>
+            <w:shd w:fill="FDE8E5"/>
+            <w:vAlign w:val="center"/>
+          </w:tcPr>
+          <w:p>
+            <w:pPr>
+              <w:spacing w:after="40"/>
+              <w:jc w:val="left"/>
+            </w:pPr>
+            <w:r/>
+            <w:r>
+              <w:rPr>
+                <w:rFonts w:ascii="Calibri" w:hAnsi="Calibri" w:eastAsia="Microsoft YaHei"/>
+                <w:b/>
+                <w:color w:val="17212B"/>
+                <w:sz w:val="19"/>
+              </w:rPr>
+              <w:t>Context Relevance</w:t>
+            </w:r>
+          </w:p>
+        </w:tc>
+        <w:tc>
+          <w:tcPr>
+            <w:tcW w:type="dxa" w:w="2412"/>
+            <w:shd w:fill="FDE8E5"/>
+            <w:vAlign w:val="center"/>
+          </w:tcPr>
+          <w:p>
+            <w:pPr>
+              <w:spacing w:after="40"/>
+              <w:jc w:val="left"/>
+            </w:pPr>
+            <w:r/>
+            <w:r>
+              <w:rPr>
+                <w:rFonts w:ascii="Calibri" w:hAnsi="Calibri" w:eastAsia="Microsoft YaHei"/>
+                <w:b/>
+                <w:color w:val="17212B"/>
+                <w:sz w:val="19"/>
+              </w:rPr>
+              <w:t>Top1 Hit</w:t>
+            </w:r>
+          </w:p>
+        </w:tc>
+        <w:tc>
+          <w:tcPr>
+            <w:tcW w:type="dxa" w:w="2412"/>
+            <w:shd w:fill="FDE8E5"/>
+            <w:vAlign w:val="center"/>
+          </w:tcPr>
+          <w:p>
+            <w:pPr>
+              <w:spacing w:after="40"/>
+              <w:jc w:val="left"/>
+            </w:pPr>
+            <w:r/>
+            <w:r>
+              <w:rPr>
+                <w:rFonts w:ascii="Calibri" w:hAnsi="Calibri" w:eastAsia="Microsoft YaHei"/>
+                <w:b/>
+                <w:color w:val="17212B"/>
+                <w:sz w:val="19"/>
+              </w:rPr>
+              <w:t>MRR</w:t>
+            </w:r>
+          </w:p>
+        </w:tc>
+      </w:tr>
+      <w:tr>
+        <w:tc>
+          <w:tcPr>
+            <w:tcW w:type="dxa" w:w="2412"/>
+            <w:vAlign w:val="center"/>
+          </w:tcPr>
+          <w:p>
+            <w:pPr>
+              <w:spacing w:after="40"/>
+              <w:jc w:val="left"/>
+            </w:pPr>
+            <w:r/>
+            <w:r>
+              <w:rPr>
+                <w:rFonts w:ascii="Calibri" w:hAnsi="Calibri" w:eastAsia="Microsoft YaHei"/>
+                <w:b w:val="0"/>
+                <w:color w:val="17212B"/>
+                <w:sz w:val="19"/>
+              </w:rPr>
+              <w:t>pure_vector</w:t>
+            </w:r>
+          </w:p>
+        </w:tc>
+        <w:tc>
+          <w:tcPr>
+            <w:tcW w:type="dxa" w:w="2412"/>
+            <w:vAlign w:val="center"/>
+          </w:tcPr>
+          <w:p>
+            <w:pPr>
+              <w:spacing w:after="40"/>
+              <w:jc w:val="left"/>
+            </w:pPr>
+            <w:r/>
+            <w:r>
+              <w:rPr>
+                <w:rFonts w:ascii="Calibri" w:hAnsi="Calibri" w:eastAsia="Microsoft YaHei"/>
+                <w:b w:val="0"/>
+                <w:color w:val="17212B"/>
+                <w:sz w:val="19"/>
+              </w:rPr>
+              <w:t>0.8750</w:t>
+            </w:r>
+          </w:p>
+        </w:tc>
+        <w:tc>
+          <w:tcPr>
+            <w:tcW w:type="dxa" w:w="2412"/>
+            <w:vAlign w:val="center"/>
+          </w:tcPr>
+          <w:p>
+            <w:pPr>
+              <w:spacing w:after="40"/>
+              <w:jc w:val="left"/>
+            </w:pPr>
+            <w:r/>
+            <w:r>
+              <w:rPr>
+                <w:rFonts w:ascii="Calibri" w:hAnsi="Calibri" w:eastAsia="Microsoft YaHei"/>
+                <w:b w:val="0"/>
+                <w:color w:val="17212B"/>
+                <w:sz w:val="19"/>
+              </w:rPr>
+              <w:t>0.8000</w:t>
+            </w:r>
+          </w:p>
+        </w:tc>
+        <w:tc>
+          <w:tcPr>
+            <w:tcW w:type="dxa" w:w="2412"/>
+            <w:vAlign w:val="center"/>
+          </w:tcPr>
+          <w:p>
+            <w:pPr>
+              <w:spacing w:after="40"/>
+              <w:jc w:val="left"/>
+            </w:pPr>
+            <w:r/>
+            <w:r>
+              <w:rPr>
+                <w:rFonts w:ascii="Calibri" w:hAnsi="Calibri" w:eastAsia="Microsoft YaHei"/>
+                <w:b w:val="0"/>
+                <w:color w:val="17212B"/>
+                <w:sz w:val="19"/>
+              </w:rPr>
+              <w:t>0.8267</w:t>
+            </w:r>
+          </w:p>
+        </w:tc>
+      </w:tr>
+      <w:tr>
+        <w:tc>
+          <w:tcPr>
+            <w:tcW w:type="dxa" w:w="2412"/>
+            <w:vAlign w:val="center"/>
+          </w:tcPr>
+          <w:p>
+            <w:pPr>
+              <w:spacing w:after="40"/>
+              <w:jc w:val="left"/>
+            </w:pPr>
+            <w:r/>
+            <w:r>
+              <w:rPr>
+                <w:rFonts w:ascii="Calibri" w:hAnsi="Calibri" w:eastAsia="Microsoft YaHei"/>
+                <w:b w:val="0"/>
+                <w:color w:val="17212B"/>
+                <w:sz w:val="19"/>
+              </w:rPr>
+              <w:t>BM25</w:t>
+            </w:r>
+          </w:p>
+        </w:tc>
+        <w:tc>
+          <w:tcPr>
+            <w:tcW w:type="dxa" w:w="2412"/>
+            <w:vAlign w:val="center"/>
+          </w:tcPr>
+          <w:p>
+            <w:pPr>
+              <w:spacing w:after="40"/>
+              <w:jc w:val="left"/>
+            </w:pPr>
+            <w:r/>
+            <w:r>
+              <w:rPr>
+                <w:rFonts w:ascii="Calibri" w:hAnsi="Calibri" w:eastAsia="Microsoft YaHei"/>
+                <w:b w:val="0"/>
+                <w:color w:val="17212B"/>
+                <w:sz w:val="19"/>
+              </w:rPr>
+              <w:t>1.0000</w:t>
+            </w:r>
+          </w:p>
+        </w:tc>
+        <w:tc>
+          <w:tcPr>
+            <w:tcW w:type="dxa" w:w="2412"/>
+            <w:vAlign w:val="center"/>
+          </w:tcPr>
+          <w:p>
+            <w:pPr>
+              <w:spacing w:after="40"/>
+              <w:jc w:val="left"/>
+            </w:pPr>
+            <w:r/>
+            <w:r>
+              <w:rPr>
+                <w:rFonts w:ascii="Calibri" w:hAnsi="Calibri" w:eastAsia="Microsoft YaHei"/>
+                <w:b w:val="0"/>
+                <w:color w:val="17212B"/>
+                <w:sz w:val="19"/>
+              </w:rPr>
+              <w:t>1.0000</w:t>
+            </w:r>
+          </w:p>
+        </w:tc>
+        <w:tc>
+          <w:tcPr>
+            <w:tcW w:type="dxa" w:w="2412"/>
+            <w:vAlign w:val="center"/>
+          </w:tcPr>
+          <w:p>
+            <w:pPr>
+              <w:spacing w:after="40"/>
+              <w:jc w:val="left"/>
+            </w:pPr>
+            <w:r/>
+            <w:r>
+              <w:rPr>
+                <w:rFonts w:ascii="Calibri" w:hAnsi="Calibri" w:eastAsia="Microsoft YaHei"/>
+                <w:b w:val="0"/>
+                <w:color w:val="17212B"/>
+                <w:sz w:val="19"/>
+              </w:rPr>
+              <w:t>1.0000</w:t>
+            </w:r>
+          </w:p>
+        </w:tc>
+      </w:tr>
+      <w:tr>
+        <w:tc>
+          <w:tcPr>
+            <w:tcW w:type="dxa" w:w="2412"/>
+            <w:vAlign w:val="center"/>
+          </w:tcPr>
+          <w:p>
+            <w:pPr>
+              <w:spacing w:after="40"/>
+              <w:jc w:val="left"/>
+            </w:pPr>
+            <w:r/>
+            <w:r>
+              <w:rPr>
+                <w:rFonts w:ascii="Calibri" w:hAnsi="Calibri" w:eastAsia="Microsoft YaHei"/>
+                <w:b w:val="0"/>
+                <w:color w:val="17212B"/>
+                <w:sz w:val="19"/>
+              </w:rPr>
+              <w:t>hybrid</w:t>
+            </w:r>
+          </w:p>
+        </w:tc>
+        <w:tc>
+          <w:tcPr>
+            <w:tcW w:type="dxa" w:w="2412"/>
+            <w:vAlign w:val="center"/>
+          </w:tcPr>
+          <w:p>
+            <w:pPr>
+              <w:spacing w:after="40"/>
+              <w:jc w:val="left"/>
+            </w:pPr>
+            <w:r/>
+            <w:r>
+              <w:rPr>
+                <w:rFonts w:ascii="Calibri" w:hAnsi="Calibri" w:eastAsia="Microsoft YaHei"/>
+                <w:b w:val="0"/>
+                <w:color w:val="17212B"/>
+                <w:sz w:val="19"/>
+              </w:rPr>
+              <w:t>0.9750</w:t>
+            </w:r>
+          </w:p>
+        </w:tc>
+        <w:tc>
+          <w:tcPr>
+            <w:tcW w:type="dxa" w:w="2412"/>
+            <w:vAlign w:val="center"/>
+          </w:tcPr>
+          <w:p>
+            <w:pPr>
+              <w:spacing w:after="40"/>
+              <w:jc w:val="left"/>
+            </w:pPr>
+            <w:r/>
+            <w:r>
+              <w:rPr>
+                <w:rFonts w:ascii="Calibri" w:hAnsi="Calibri" w:eastAsia="Microsoft YaHei"/>
+                <w:b w:val="0"/>
+                <w:color w:val="17212B"/>
+                <w:sz w:val="19"/>
+              </w:rPr>
+              <w:t>1.0000</w:t>
+            </w:r>
+          </w:p>
+        </w:tc>
+        <w:tc>
+          <w:tcPr>
+            <w:tcW w:type="dxa" w:w="2412"/>
+            <w:vAlign w:val="center"/>
+          </w:tcPr>
+          <w:p>
+            <w:pPr>
+              <w:spacing w:after="40"/>
+              <w:jc w:val="left"/>
+            </w:pPr>
+            <w:r/>
+            <w:r>
+              <w:rPr>
+                <w:rFonts w:ascii="Calibri" w:hAnsi="Calibri" w:eastAsia="Microsoft YaHei"/>
+                <w:b w:val="0"/>
+                <w:color w:val="17212B"/>
+                <w:sz w:val="19"/>
+              </w:rPr>
+              <w:t>1.0000</w:t>
+            </w:r>
+          </w:p>
+        </w:tc>
+      </w:tr>
+      <w:tr>
+        <w:tc>
+          <w:tcPr>
+            <w:tcW w:type="dxa" w:w="2412"/>
+            <w:vAlign w:val="center"/>
+          </w:tcPr>
+          <w:p>
+            <w:pPr>
+              <w:spacing w:after="40"/>
+              <w:jc w:val="left"/>
+            </w:pPr>
+            <w:r/>
+            <w:r>
+              <w:rPr>
+                <w:rFonts w:ascii="Calibri" w:hAnsi="Calibri" w:eastAsia="Microsoft YaHei"/>
+                <w:b w:val="0"/>
+                <w:color w:val="17212B"/>
+                <w:sz w:val="19"/>
+              </w:rPr>
+              <w:t>hybrid + rerank</w:t>
+            </w:r>
+          </w:p>
+        </w:tc>
+        <w:tc>
+          <w:tcPr>
+            <w:tcW w:type="dxa" w:w="2412"/>
+            <w:vAlign w:val="center"/>
+          </w:tcPr>
+          <w:p>
+            <w:pPr>
+              <w:spacing w:after="40"/>
+              <w:jc w:val="left"/>
+            </w:pPr>
+            <w:r/>
+            <w:r>
+              <w:rPr>
+                <w:rFonts w:ascii="Calibri" w:hAnsi="Calibri" w:eastAsia="Microsoft YaHei"/>
+                <w:b w:val="0"/>
+                <w:color w:val="17212B"/>
+                <w:sz w:val="19"/>
+              </w:rPr>
+              <w:t>0.9750</w:t>
+            </w:r>
+          </w:p>
+        </w:tc>
+        <w:tc>
+          <w:tcPr>
+            <w:tcW w:type="dxa" w:w="2412"/>
+            <w:vAlign w:val="center"/>
+          </w:tcPr>
+          <w:p>
+            <w:pPr>
+              <w:spacing w:after="40"/>
+              <w:jc w:val="left"/>
+            </w:pPr>
+            <w:r/>
+            <w:r>
+              <w:rPr>
+                <w:rFonts w:ascii="Calibri" w:hAnsi="Calibri" w:eastAsia="Microsoft YaHei"/>
+                <w:b w:val="0"/>
+                <w:color w:val="17212B"/>
+                <w:sz w:val="19"/>
+              </w:rPr>
+              <w:t>1.0000</w:t>
+            </w:r>
+          </w:p>
+        </w:tc>
+        <w:tc>
+          <w:tcPr>
+            <w:tcW w:type="dxa" w:w="2412"/>
+            <w:vAlign w:val="center"/>
+          </w:tcPr>
+          <w:p>
+            <w:pPr>
+              <w:spacing w:after="40"/>
+              <w:jc w:val="left"/>
+            </w:pPr>
+            <w:r/>
+            <w:r>
+              <w:rPr>
+                <w:rFonts w:ascii="Calibri" w:hAnsi="Calibri" w:eastAsia="Microsoft YaHei"/>
+                <w:b w:val="0"/>
+                <w:color w:val="17212B"/>
+                <w:sz w:val="19"/>
+              </w:rPr>
+              <w:t>1.0000</w:t>
+            </w:r>
+          </w:p>
+        </w:tc>
+      </w:tr>
+    </w:tbl>
+    <w:p/>
+    <w:p>
+      <w:r>
+        <w:rPr>
+          <w:rFonts w:ascii="Calibri" w:hAnsi="Calibri" w:eastAsia="Microsoft YaHei"/>
+          <w:color w:val="17212B"/>
+          <w:sz w:val="21"/>
+        </w:rPr>
+        <w:t>消融结果有两个结论。第一，Redis 问答非常依赖精确术语，BM25 在当前知识库和评估集上表现强于 pure vector。第二，hybrid 方案仍适合作为默认方案，因为它兼顾关键词匹配和语义相似度，在换成 BGE embedding、扩大知识库或面对更口语化问题时具有更好的扩展性。轻量 reranker 在平均指标上没有明显超过 hybrid，但它提供了更强的排序解释能力，并能在生成阶段减少弱相关上下文污染。</w:t>
       </w:r>
     </w:p>
     <w:p>
@@ -2099,7 +2848,7 @@
         <w:pStyle w:val="Heading1"/>
       </w:pPr>
       <w:r>
-        <w:t>11. 案例分析</w:t>
+        <w:t>12. 案例分析</w:t>
       </w:r>
     </w:p>
     <w:p>
@@ -2175,16 +2924,6 @@
           <w:sz w:val="20"/>
         </w:rPr>
         <w:t>生产中可以同时开启 RDB 和 AOF。</w:t>
-      </w:r>
-    </w:p>
-    <w:p>
-      <w:r>
-        <w:rPr>
-          <w:rFonts w:ascii="Calibri" w:hAnsi="Calibri" w:eastAsia="Microsoft YaHei"/>
-          <w:color w:val="17212B"/>
-          <w:sz w:val="21"/>
-        </w:rPr>
-        <w:t>这个案例说明，混合检索能够利用 AOF 和 RDB 的精确匹配能力，把问题定位到持久化文档，而不是仅凭“持久化”这个普通词进行模糊匹配。</w:t>
       </w:r>
     </w:p>
     <w:p>
@@ -2493,7 +3232,7 @@
           <w:color w:val="17212B"/>
           <w:sz w:val="21"/>
         </w:rPr>
-        <w:t>因此，这个案例不仅展示最终答案，也展示了 RAG 系统可解释调试的价值：当老师或用户质疑“为什么选这个文档”时，可以直接查看检索分数和术语覆盖，而不是只看模型生成的自然语言。</w:t>
+        <w:t>这个案例说明，混合检索能够利用 AOF 和 RDB 的精确匹配能力，把问题定位到持久化文档，而不是仅凭“持久化”这个普通词进行模糊匹配。同时，答案中的引用会经过 citation checking，保证 [1] 指向当前检索上下文中真实存在的文档片段。</w:t>
       </w:r>
     </w:p>
     <w:p>
@@ -2501,7 +3240,7 @@
         <w:pStyle w:val="Heading1"/>
       </w:pPr>
       <w:r>
-        <w:t>12. Bad Case 与局限</w:t>
+        <w:t>13. Bad Case 与局限</w:t>
       </w:r>
     </w:p>
     <w:p>
@@ -2509,7 +3248,7 @@
         <w:pStyle w:val="Heading2"/>
       </w:pPr>
       <w:r>
-        <w:t>12.1 弱相关上下文污染</w:t>
+        <w:t>13.1 弱相关上下文污染</w:t>
       </w:r>
     </w:p>
     <w:p>
@@ -2519,7 +3258,7 @@
           <w:color w:val="17212B"/>
           <w:sz w:val="21"/>
         </w:rPr>
-        <w:t>早期版本中，AOF/RDB 问题会把 Pub/Sub 文档排到较前位置，因为 Pub/Sub 文档中也出现了“不会持久化”。这类共现词会造成弱相关上下文污染。当前版本通过 Query Rewriting、BM25/Vector Hybrid Retrieval、Lightweight Reranking 和生成阶段分数阈值过滤共同缓解这个问题。</w:t>
+        <w:t>早期版本中，AOF/RDB 问题会把 Pub/Sub 文档排到较前位置，因为 Pub/Sub 文档中也出现了“不会持久化”。这类共现词会造成弱相关上下文污染。当前版本通过 Query Rewriting、BM25/Vector Hybrid Retrieval、Reranking 和生成阶段分数阈值过滤共同缓解这个问题。</w:t>
       </w:r>
     </w:p>
     <w:p>
@@ -2529,7 +3268,7 @@
           <w:color w:val="17212B"/>
           <w:sz w:val="21"/>
         </w:rPr>
-        <w:t>需要注意的是，RAG 系统并不是要完全消灭弱相关召回。如果 Top-k 中出现 Pub/Sub，并不一定代表系统失败，因为召回阶段本来就允许保留部分候选。关键在于排序和过滤阶段能否把真正相关的 redis:persistence 放在最前，并阻止弱相关上下文进入最终答案。当前 AOF/RDB 案例中，Pub/Sub 仍出现在 Top-k，但其最终分数明显低于 persistence，因此不会被抽取式生成器作为主要依据。</w:t>
+        <w:t>需要注意的是，RAG 系统并不是要完全消灭弱相关召回。如果 Top-k 中出现 Pub/Sub，并不一定代表系统失败，因为召回阶段本来就允许保留部分候选。关键在于排序和过滤阶段能否把真正相关的 redis:persistence 放在最前，并阻止弱相关上下文进入最终答案。</w:t>
       </w:r>
     </w:p>
     <w:p>
@@ -2537,7 +3276,7 @@
         <w:pStyle w:val="Heading2"/>
       </w:pPr>
       <w:r>
-        <w:t>12.2 Embedding 能力有限</w:t>
+        <w:t>13.2 Embedding 能力有限</w:t>
       </w:r>
     </w:p>
     <w:p>
@@ -2555,7 +3294,7 @@
         <w:pStyle w:val="Heading2"/>
       </w:pPr>
       <w:r>
-        <w:t>12.3 评估集规模有限</w:t>
+        <w:t>13.3 自动评估不能完全替代人工评分</w:t>
       </w:r>
     </w:p>
     <w:p>
@@ -2565,7 +3304,7 @@
           <w:color w:val="17212B"/>
           <w:sz w:val="21"/>
         </w:rPr>
-        <w:t>内置评估集只有 10 条问题，适合作业展示，但不足以代表真实生产系统。更严谨的评估需要扩展到 50-100 条问题，并加入人工评分或 LLM-as-a-judge。</w:t>
+        <w:t>内置评估集已经扩展到 20 条问题，能覆盖核心 Redis 场景，但仍不足以代表真实生产系统。更严谨的评估需要扩展到 50-100 条问题，并加入人工评分、LLM-as-a-judge 或专家审核。</w:t>
       </w:r>
     </w:p>
     <w:p>
@@ -2573,7 +3312,7 @@
         <w:pStyle w:val="Heading2"/>
       </w:pPr>
       <w:r>
-        <w:t>12.4 生成自然度与忠实度权衡</w:t>
+        <w:t>13.4 Citation checking 仍是轻量版本</w:t>
       </w:r>
     </w:p>
     <w:p>
@@ -2583,7 +3322,7 @@
           <w:color w:val="17212B"/>
           <w:sz w:val="21"/>
         </w:rPr>
-        <w:t>抽取式生成器更忠实，但表达不够自然；LLM 生成更流畅，但需要更严格的上下文约束和引用检查。</w:t>
+        <w:t>当前 citation checking 主要检查引用编号和 token 支持关系。它能发现不存在引用、无引用答案、明显不匹配引用等问题，但不能完全判断复杂事实蕴含关系。后续可将其升级为基于 NLI 或 LLM judge 的自动引用核查。</w:t>
       </w:r>
     </w:p>
     <w:p>
@@ -2591,7 +3330,7 @@
         <w:pStyle w:val="Heading1"/>
       </w:pPr>
       <w:r>
-        <w:t>13. 与普通 LLM 问答的比较</w:t>
+        <w:t>14. 与普通 LLM 问答的比较</w:t>
       </w:r>
     </w:p>
     <w:p>
@@ -2657,6 +3396,19 @@
       </w:r>
     </w:p>
     <w:p>
+      <w:pPr>
+        <w:pStyle w:val="ListBullet"/>
+      </w:pPr>
+      <w:r>
+        <w:rPr>
+          <w:rFonts w:ascii="Calibri" w:hAnsi="Calibri" w:eastAsia="Microsoft YaHei"/>
+          <w:color w:val="17212B"/>
+          <w:sz w:val="20"/>
+        </w:rPr>
+        <w:t>citation checking 能对引用格式和来源关系做自动检查。</w:t>
+      </w:r>
+    </w:p>
+    <w:p>
       <w:r>
         <w:rPr>
           <w:rFonts w:ascii="Calibri" w:hAnsi="Calibri" w:eastAsia="Microsoft YaHei"/>
@@ -2671,7 +3423,7 @@
         <w:pStyle w:val="Heading1"/>
       </w:pPr>
       <w:r>
-        <w:t>14. 结论</w:t>
+        <w:t>15. 结论</w:t>
       </w:r>
     </w:p>
     <w:p>
@@ -2681,7 +3433,7 @@
           <w:color w:val="17212B"/>
           <w:sz w:val="21"/>
         </w:rPr>
-        <w:t>本文完成了一个 Redis 垂直领域 RAG 深度问答系统。系统实现了私有知识库构建、Chunking、Embedding、向量数据库、Query Rewriting、BM25/Vector Hybrid Retrieval、Lightweight Reranking、DeepSeek-compatible 生成和三维量化评估。实验结果表明，混合检索与轻量重排序适合 Redis 这类命令密集型技术文档问答，生成阶段的上下文过滤有助于减少弱相关片段导致的答案污染。</w:t>
+        <w:t>本文完成了一个 Redis 垂直领域 RAG 深度问答系统。系统实现了私有知识库构建、Chunking、Embedding、向量数据库、Query Rewriting、BM25/Vector Hybrid Retrieval、Reranking、DeepSeek-compatible 生成、citation checking、三维量化评估和检索策略消融对比。实验结果表明，混合检索与重排序适合 Redis 这类命令密集型技术文档问答，生成阶段的上下文过滤和 citation checking 有助于减少弱相关片段导致的答案污染。</w:t>
       </w:r>
     </w:p>
     <w:p>
@@ -2691,7 +3443,7 @@
           <w:color w:val="17212B"/>
           <w:sz w:val="21"/>
         </w:rPr>
-        <w:t>后续工作可以从四个方向继续优化：第一，使用 BGE 等神经 embedding 替换默认 hashing embedding；第二，将当前轻量 reranker 升级为 BGE reranker 或 cross-encoder；第三，扩大评估集并引入人工评分；第四，增强 LLM 生成后的引用校验和事实一致性检测。</w:t>
+        <w:t>当前版本已经支持 BGE embedding、FAISS/Chroma、BGE/CrossEncoder reranker、20 条评估问题、retrieval comparison 和 citation checking。后续可以进一步扩大知识库规模，引入人工评分，并把 citation checking 升级为更严格的事实一致性检测。</w:t>
       </w:r>
     </w:p>
     <w:p>
@@ -3041,7 +3793,7 @@
           <w:color w:val="D92D20"/>
           <w:sz w:val="22"/>
         </w:rPr>
-        <w:t>检索命中文档与二阶段重排序分数</w:t>
+        <w:t>检索策略消融对比结果</w:t>
       </w:r>
     </w:p>
     <w:p>
@@ -3057,11 +3809,71 @@
               <a:graphicData uri="http://schemas.openxmlformats.org/drawingml/2006/picture">
                 <pic:pic>
                   <pic:nvPicPr>
+                    <pic:cNvPr id="0" name="retrieval_comparison.png"/>
+                    <pic:cNvPicPr/>
+                  </pic:nvPicPr>
+                  <pic:blipFill>
+                    <a:blip r:embed="rId14"/>
+                    <a:stretch>
+                      <a:fillRect/>
+                    </a:stretch>
+                  </pic:blipFill>
+                  <pic:spPr>
+                    <a:xfrm>
+                      <a:off x="0" y="0"/>
+                      <a:ext cx="5715000" cy="3214688"/>
+                    </a:xfrm>
+                    <a:prstGeom prst="rect"/>
+                  </pic:spPr>
+                </pic:pic>
+              </a:graphicData>
+            </a:graphic>
+          </wp:inline>
+        </w:drawing>
+      </w:r>
+    </w:p>
+    <w:p>
+      <w:pPr>
+        <w:jc w:val="center"/>
+      </w:pPr>
+      <w:r>
+        <w:rPr>
+          <w:rFonts w:ascii="Calibri" w:hAnsi="Calibri" w:eastAsia="Microsoft YaHei"/>
+          <w:color w:val="64748B"/>
+          <w:sz w:val="18"/>
+        </w:rPr>
+        <w:t>图：检索策略消融对比结果</w:t>
+      </w:r>
+    </w:p>
+    <w:p>
+      <w:r>
+        <w:rPr>
+          <w:rFonts w:ascii="Calibri" w:hAnsi="Calibri" w:eastAsia="Microsoft YaHei"/>
+          <w:b/>
+          <w:color w:val="D92D20"/>
+          <w:sz w:val="22"/>
+        </w:rPr>
+        <w:t>检索命中文档与二阶段重排序分数</w:t>
+      </w:r>
+    </w:p>
+    <w:p>
+      <w:r>
+        <w:drawing>
+          <wp:inline xmlns:a="http://schemas.openxmlformats.org/drawingml/2006/main" xmlns:pic="http://schemas.openxmlformats.org/drawingml/2006/picture">
+            <wp:extent cx="5715000" cy="3214688"/>
+            <wp:docPr id="6" name="Picture 6"/>
+            <wp:cNvGraphicFramePr>
+              <a:graphicFrameLocks noChangeAspect="1"/>
+            </wp:cNvGraphicFramePr>
+            <a:graphic>
+              <a:graphicData uri="http://schemas.openxmlformats.org/drawingml/2006/picture">
+                <pic:pic>
+                  <pic:nvPicPr>
                     <pic:cNvPr id="0" name="retrieval_scores.png"/>
                     <pic:cNvPicPr/>
                   </pic:nvPicPr>
                   <pic:blipFill>
-                    <a:blip r:embed="rId14"/>
+                    <a:blip r:embed="rId15"/>
                     <a:stretch>
                       <a:fillRect/>
                     </a:stretch>

</xml_diff>

<commit_message>
Prepare Redis RAG coursework submission
</commit_message>
<xml_diff>
--- a/report/redis_rag_report.docx
+++ b/report/redis_rag_report.docx
@@ -3560,7 +3560,7 @@
       <w:r>
         <w:drawing>
           <wp:inline xmlns:a="http://schemas.openxmlformats.org/drawingml/2006/main" xmlns:pic="http://schemas.openxmlformats.org/drawingml/2006/picture">
-            <wp:extent cx="5715000" cy="3214688"/>
+            <wp:extent cx="5715000" cy="2786062"/>
             <wp:docPr id="1" name="Picture 1"/>
             <wp:cNvGraphicFramePr>
               <a:graphicFrameLocks noChangeAspect="1"/>
@@ -3581,7 +3581,7 @@
                   <pic:spPr>
                     <a:xfrm>
                       <a:off x="0" y="0"/>
-                      <a:ext cx="5715000" cy="3214688"/>
+                      <a:ext cx="5715000" cy="2786062"/>
                     </a:xfrm>
                     <a:prstGeom prst="rect"/>
                   </pic:spPr>

</xml_diff>

<commit_message>
Polish Redis RAG submission wording and fallback answers
</commit_message>
<xml_diff>
--- a/report/redis_rag_report.docx
+++ b/report/redis_rag_report.docx
@@ -26,7 +26,7 @@
           <w:color w:val="64748B"/>
           <w:sz w:val="23"/>
         </w:rPr>
-        <w:t>课程作业报告 | 私有知识库、混合检索、轻量重排序与三维量化评估</w:t>
+        <w:t>项目报告 | 私有知识库、混合检索、轻量重排序与三维量化评估</w:t>
       </w:r>
     </w:p>
     <w:p>
@@ -58,7 +58,7 @@
           <w:color w:val="17212B"/>
           <w:sz w:val="21"/>
         </w:rPr>
-        <w:t>本文围绕 Redis 技术文档构建了一个垂直领域深度问答系统。系统以 Redis 官方文档主题和清洗后的课程语料为私有知识库，完成了文档采集、文本清洗、Chunking、Embedding、向量数据库构建、Query Rewriting、混合检索、二阶段重排序、基于上下文的答案生成、自动 citation checking 和三维量化评估。针对 Redis 问答中命令名、缩写和概念术语密集的特点，系统默认采用可复现的 hashing embedding 与 BM25/Vector Hybrid Retrieval，同时提供 BGE embedding、FAISS/Chroma 向量库、BGE reranker/CrossEncoder reranker 等增强入口。实验在 20 条 Redis 技术问题上评估 Context Relevance、Faithfulness 和 Answer Relevance，结果分别为 0.9750、0.8319 和 0.9375；检索消融实验显示，pure vector、BM25、hybrid、hybrid+rerank 的 Context Relevance 分别为 0.8750、1.0000、0.9750 和 0.9750。结果表明，Redis 这类命令密集型技术问答非常依赖精确术语匹配，混合检索与重排序能提高可解释性并减少弱相关上下文污染，citation checking 则为生成答案提供了额外的幻觉防护。</w:t>
+        <w:t>本文围绕 Redis 技术文档构建了一个垂直领域深度问答系统。系统以 Redis 官方文档主题和清洗后的技术语料为私有知识库，完成了文档采集、文本清洗、Chunking、Embedding、向量数据库构建、Query Rewriting、混合检索、二阶段重排序、基于上下文的答案生成、自动 citation checking 和三维量化评估。针对 Redis 问答中命令名、缩写和概念术语密集的特点，系统默认采用可复现的 hashing embedding 与 BM25/Vector Hybrid Retrieval，同时提供 BGE embedding、FAISS/Chroma 向量库、BGE reranker/CrossEncoder reranker 等增强入口。实验在 20 条 Redis 技术问题上评估 Context Relevance、Faithfulness 和 Answer Relevance，结果分别为 0.9750、0.8319 和 0.9375；检索消融实验显示，pure vector、BM25、hybrid、hybrid+rerank 的 Context Relevance 分别为 0.8750、1.0000、0.9750 和 0.9750。结果表明，Redis 这类命令密集型技术问答非常依赖精确术语匹配，混合检索与重排序能提高可解释性并减少弱相关上下文污染，citation checking 则为生成答案提供了额外的幻觉防护。</w:t>
       </w:r>
     </w:p>
     <w:p>
@@ -264,7 +264,7 @@
           <w:color w:val="17212B"/>
           <w:sz w:val="21"/>
         </w:rPr>
-        <w:t>第一种是内置清洗语料 data/raw/redis_seed_docs.jsonl。它覆盖 Redis 数据类型、过期机制、内存淘汰、持久化、复制、Sentinel、Cluster、事务、Lua 脚本、Pub/Sub 和缓存风险等主题。内置语料保证作业可以离线运行，不依赖网络和外部数据库。</w:t>
+        <w:t>第一种是内置清洗语料 data/raw/redis_seed_docs.jsonl。它覆盖 Redis 数据类型、过期机制、内存淘汰、持久化、复制、Sentinel、Cluster、事务、Lua 脚本、Pub/Sub 和缓存风险等主题。内置语料保证系统可以离线运行，不依赖网络和外部数据库。</w:t>
       </w:r>
     </w:p>
     <w:p>
@@ -1084,7 +1084,7 @@
           <w:color w:val="17212B"/>
           <w:sz w:val="21"/>
         </w:rPr>
-        <w:t>本项目默认使用 deterministic hashing embedding。它将 Redis-aware token 映射到固定维度向量，并进行归一化。选择这一默认方案主要出于课程复现考虑：</w:t>
+        <w:t>本项目默认使用 deterministic hashing embedding。它将 Redis-aware token 映射到固定维度向量，并进行归一化。选择这一默认方案主要出于本地复现考虑：</w:t>
       </w:r>
     </w:p>
     <w:p>
@@ -1164,7 +1164,7 @@
           <w:color w:val="17212B"/>
           <w:sz w:val="21"/>
         </w:rPr>
-        <w:t>为了提高作业难度和工程完整度，项目已经提供 SentenceTransformerEmbeddingModel。安装 sentence-transformers 后，可以通过命令行切换到 BGE：</w:t>
+        <w:t>为了提高工程完整度，项目已经提供 SentenceTransformerEmbeddingModel。安装 sentence-transformers 后，可以通过命令行切换到 BGE：</w:t>
       </w:r>
     </w:p>
     <w:p>
@@ -1228,7 +1228,7 @@
           <w:color w:val="17212B"/>
           <w:sz w:val="21"/>
         </w:rPr>
-        <w:t>该方式透明、易检查，适合课程讲解“向量数据库中到底保存了什么”。同时，项目已经提供 FAISS 和 Chroma 入口：FAISS 使用 IndexFlatIP 做内积检索，Chroma 使用 in-memory collection 做本地实验。普通验收时使用 local 后端即可；如果老师希望看到更接近生产系统的实现，可以安装可选依赖后切换后端。</w:t>
+        <w:t>该方式透明、易检查，适合解释“向量数据库中到底保存了什么”。同时，项目已经提供 FAISS 和 Chroma 入口：FAISS 使用 IndexFlatIP 做内积检索，Chroma 使用 in-memory collection 做本地实验。常规运行时使用 local 后端即可；如果需要更接近生产系统的实现，可以安装可选依赖后切换后端。</w:t>
       </w:r>
     </w:p>
     <w:p>
@@ -1771,7 +1771,7 @@
           <w:color w:val="17212B"/>
           <w:sz w:val="21"/>
         </w:rPr>
-        <w:t>CrossEncoder reranker 会把“问题 + 候选片段”作为成对输入重新打分，相比只看 term coverage 的轻量方法，能更好处理同义表达和长距离语义关系。考虑到课程复现环境不一定有模型缓存或 GPU，默认仍保留轻量 reranker。</w:t>
+        <w:t>CrossEncoder reranker 会把“问题 + 候选片段”作为成对输入重新打分，相比只看 term coverage 的轻量方法，能更好处理同义表达和长距离语义关系。考虑到本地运行环境不一定有模型缓存或 GPU，默认仍保留轻量 reranker。</w:t>
       </w:r>
     </w:p>
     <w:p>
@@ -1904,7 +1904,7 @@
           <w:color w:val="17212B"/>
           <w:sz w:val="21"/>
         </w:rPr>
-        <w:t>第二，抽取式生成器。没有 API key 时，系统从检索上下文中抽取与问题 token 重合度最高的句子，生成可追溯答案。抽取式生成不如 LLM 自然，但能保证作业在离线环境中完整运行。</w:t>
+        <w:t>第二，抽取式生成器。没有 API key 时，系统从检索上下文中抽取与问题 token 重合度最高的句子，生成可追溯答案。抽取式生成不如 LLM 自然，但能保证系统在离线环境中完整运行。</w:t>
       </w:r>
     </w:p>
     <w:p>
@@ -2012,7 +2012,7 @@
           <w:color w:val="17212B"/>
           <w:sz w:val="21"/>
         </w:rPr>
-        <w:t>它主要评价生成模块是否发生幻觉。当前实现是轻量自动指标，适合作业展示；更严格版本可以使用 NLI 模型、LLM-as-a-judge 或人工标注。</w:t>
+        <w:t>它主要评价生成模块是否发生幻觉。当前实现是轻量自动指标，适合快速评估；更严格版本可以使用 NLI 模型、模型裁判或人工标注。</w:t>
       </w:r>
     </w:p>
     <w:p>
@@ -3304,7 +3304,7 @@
           <w:color w:val="17212B"/>
           <w:sz w:val="21"/>
         </w:rPr>
-        <w:t>内置评估集已经扩展到 20 条问题，能覆盖核心 Redis 场景，但仍不足以代表真实生产系统。更严谨的评估需要扩展到 50-100 条问题，并加入人工评分、LLM-as-a-judge 或专家审核。</w:t>
+        <w:t>内置评估集已经扩展到 20 条问题，能覆盖核心 Redis 场景，但仍不足以代表真实生产系统。更严谨的评估需要扩展到 50-100 条问题，并加入人工评分、模型裁判或专家审核。</w:t>
       </w:r>
     </w:p>
     <w:p>
@@ -3929,7 +3929,7 @@
         <w:color w:val="64748B"/>
         <w:sz w:val="17"/>
       </w:rPr>
-      <w:t>Redis-RAG 课程作业报告</w:t>
+      <w:t>Redis-RAG 项目报告</w:t>
     </w:r>
   </w:p>
 </w:ftr>

</xml_diff>